<commit_message>
chore: atualizar graphify, arquivos de reforco matematica e avaliacoes TIC
Co-Authored-By: Claude Sonnet 4.6 <noreply@anthropic.com>
</commit_message>
<xml_diff>
--- a/sistema/INTRODUCAO_A_TECNOLOGIA_DA_INFORMACAO_E_COMUNICACAO/AVALIACOES_CRIADAS/PROVA_PRATICA_UC1_TIC.docx
+++ b/sistema/INTRODUCAO_A_TECNOLOGIA_DA_INFORMACAO_E_COMUNICACAO/AVALIACOES_CRIADAS/PROVA_PRATICA_UC1_TIC.docx
@@ -85,12 +85,6 @@
         <w:gridCol w:w="6014"/>
       </w:tblGrid>
       <w:tr>
-        <w:tblPrEx>
-          <w:tblCellMar>
-            <w:top w:w="0" w:type="dxa"/>
-            <w:bottom w:w="0" w:type="dxa"/>
-          </w:tblCellMar>
-        </w:tblPrEx>
         <w:tc>
           <w:tcPr>
             <w:tcW w:w="3200" w:type="dxa"/>
@@ -112,16 +106,14 @@
             <w:tcW w:w="6014" w:type="dxa"/>
             <w:vAlign w:val="center"/>
           </w:tcPr>
-          <w:p/>
+          <w:p>
+            <w:r>
+              <w:t>26/08/2026</w:t>
+            </w:r>
+          </w:p>
         </w:tc>
       </w:tr>
       <w:tr>
-        <w:tblPrEx>
-          <w:tblCellMar>
-            <w:top w:w="0" w:type="dxa"/>
-            <w:bottom w:w="0" w:type="dxa"/>
-          </w:tblCellMar>
-        </w:tblPrEx>
         <w:tc>
           <w:tcPr>
             <w:tcW w:w="3200" w:type="dxa"/>
@@ -161,12 +153,6 @@
         </w:tc>
       </w:tr>
       <w:tr>
-        <w:tblPrEx>
-          <w:tblCellMar>
-            <w:top w:w="0" w:type="dxa"/>
-            <w:bottom w:w="0" w:type="dxa"/>
-          </w:tblCellMar>
-        </w:tblPrEx>
         <w:tc>
           <w:tcPr>
             <w:tcW w:w="3200" w:type="dxa"/>
@@ -196,12 +182,6 @@
         </w:tc>
       </w:tr>
       <w:tr>
-        <w:tblPrEx>
-          <w:tblCellMar>
-            <w:top w:w="0" w:type="dxa"/>
-            <w:bottom w:w="0" w:type="dxa"/>
-          </w:tblCellMar>
-        </w:tblPrEx>
         <w:tc>
           <w:tcPr>
             <w:tcW w:w="3200" w:type="dxa"/>
@@ -231,12 +211,6 @@
         </w:tc>
       </w:tr>
       <w:tr>
-        <w:tblPrEx>
-          <w:tblCellMar>
-            <w:top w:w="0" w:type="dxa"/>
-            <w:bottom w:w="0" w:type="dxa"/>
-          </w:tblCellMar>
-        </w:tblPrEx>
         <w:tc>
           <w:tcPr>
             <w:tcW w:w="3200" w:type="dxa"/>
@@ -259,19 +233,23 @@
             <w:vAlign w:val="center"/>
           </w:tcPr>
           <w:p>
-            <w:r>
-              <w:t>preenchimento pelo docente</w:t>
+            <w:pPr>
+              <w:rPr>
+                <w:b/>
+                <w:bCs/>
+              </w:rPr>
+            </w:pPr>
+            <w:r>
+              <w:rPr>
+                <w:b/>
+                <w:bCs/>
+              </w:rPr>
+              <w:t>AI OPIR 2026/2 V1</w:t>
             </w:r>
           </w:p>
         </w:tc>
       </w:tr>
       <w:tr>
-        <w:tblPrEx>
-          <w:tblCellMar>
-            <w:top w:w="0" w:type="dxa"/>
-            <w:bottom w:w="0" w:type="dxa"/>
-          </w:tblCellMar>
-        </w:tblPrEx>
         <w:tc>
           <w:tcPr>
             <w:tcW w:w="3200" w:type="dxa"/>
@@ -293,11 +271,7 @@
             <w:tcW w:w="6014" w:type="dxa"/>
             <w:vAlign w:val="center"/>
           </w:tcPr>
-          <w:p>
-            <w:r>
-              <w:t>preenchimento pelo estudante</w:t>
-            </w:r>
-          </w:p>
+          <w:p/>
         </w:tc>
       </w:tr>
     </w:tbl>
@@ -399,7 +373,6 @@
       <w:pPr>
         <w:shd w:val="clear" w:color="1F3864" w:fill="1F3864"/>
         <w:spacing w:before="300" w:after="120"/>
-        <w:ind w:left="100"/>
       </w:pPr>
       <w:r>
         <w:rPr>
@@ -772,12 +745,6 @@
         <w:gridCol w:w="2847"/>
       </w:tblGrid>
       <w:tr>
-        <w:tblPrEx>
-          <w:tblCellMar>
-            <w:top w:w="0" w:type="dxa"/>
-            <w:bottom w:w="0" w:type="dxa"/>
-          </w:tblCellMar>
-        </w:tblPrEx>
         <w:tc>
           <w:tcPr>
             <w:tcW w:w="10347" w:type="dxa"/>
@@ -798,12 +765,6 @@
         </w:tc>
       </w:tr>
       <w:tr>
-        <w:tblPrEx>
-          <w:tblCellMar>
-            <w:top w:w="0" w:type="dxa"/>
-            <w:bottom w:w="0" w:type="dxa"/>
-          </w:tblCellMar>
-        </w:tblPrEx>
         <w:tc>
           <w:tcPr>
             <w:tcW w:w="500" w:type="dxa"/>
@@ -857,12 +818,6 @@
         </w:tc>
       </w:tr>
       <w:tr>
-        <w:tblPrEx>
-          <w:tblCellMar>
-            <w:top w:w="0" w:type="dxa"/>
-            <w:bottom w:w="0" w:type="dxa"/>
-          </w:tblCellMar>
-        </w:tblPrEx>
         <w:tc>
           <w:tcPr>
             <w:tcW w:w="500" w:type="dxa"/>
@@ -926,12 +881,6 @@
         </w:tc>
       </w:tr>
       <w:tr>
-        <w:tblPrEx>
-          <w:tblCellMar>
-            <w:top w:w="0" w:type="dxa"/>
-            <w:bottom w:w="0" w:type="dxa"/>
-          </w:tblCellMar>
-        </w:tblPrEx>
         <w:tc>
           <w:tcPr>
             <w:tcW w:w="500" w:type="dxa"/>
@@ -979,12 +928,6 @@
         </w:tc>
       </w:tr>
       <w:tr>
-        <w:tblPrEx>
-          <w:tblCellMar>
-            <w:top w:w="0" w:type="dxa"/>
-            <w:bottom w:w="0" w:type="dxa"/>
-          </w:tblCellMar>
-        </w:tblPrEx>
         <w:tc>
           <w:tcPr>
             <w:tcW w:w="500" w:type="dxa"/>
@@ -1032,12 +975,6 @@
         </w:tc>
       </w:tr>
       <w:tr>
-        <w:tblPrEx>
-          <w:tblCellMar>
-            <w:top w:w="0" w:type="dxa"/>
-            <w:bottom w:w="0" w:type="dxa"/>
-          </w:tblCellMar>
-        </w:tblPrEx>
         <w:tc>
           <w:tcPr>
             <w:tcW w:w="500" w:type="dxa"/>
@@ -1110,12 +1047,6 @@
         <w:gridCol w:w="2847"/>
       </w:tblGrid>
       <w:tr>
-        <w:tblPrEx>
-          <w:tblCellMar>
-            <w:top w:w="0" w:type="dxa"/>
-            <w:bottom w:w="0" w:type="dxa"/>
-          </w:tblCellMar>
-        </w:tblPrEx>
         <w:tc>
           <w:tcPr>
             <w:tcW w:w="10347" w:type="dxa"/>
@@ -1136,12 +1067,6 @@
         </w:tc>
       </w:tr>
       <w:tr>
-        <w:tblPrEx>
-          <w:tblCellMar>
-            <w:top w:w="0" w:type="dxa"/>
-            <w:bottom w:w="0" w:type="dxa"/>
-          </w:tblCellMar>
-        </w:tblPrEx>
         <w:tc>
           <w:tcPr>
             <w:tcW w:w="500" w:type="dxa"/>
@@ -1195,12 +1120,6 @@
         </w:tc>
       </w:tr>
       <w:tr>
-        <w:tblPrEx>
-          <w:tblCellMar>
-            <w:top w:w="0" w:type="dxa"/>
-            <w:bottom w:w="0" w:type="dxa"/>
-          </w:tblCellMar>
-        </w:tblPrEx>
         <w:tc>
           <w:tcPr>
             <w:tcW w:w="500" w:type="dxa"/>
@@ -1248,12 +1167,6 @@
         </w:tc>
       </w:tr>
       <w:tr>
-        <w:tblPrEx>
-          <w:tblCellMar>
-            <w:top w:w="0" w:type="dxa"/>
-            <w:bottom w:w="0" w:type="dxa"/>
-          </w:tblCellMar>
-        </w:tblPrEx>
         <w:tc>
           <w:tcPr>
             <w:tcW w:w="500" w:type="dxa"/>
@@ -1301,12 +1214,6 @@
         </w:tc>
       </w:tr>
       <w:tr>
-        <w:tblPrEx>
-          <w:tblCellMar>
-            <w:top w:w="0" w:type="dxa"/>
-            <w:bottom w:w="0" w:type="dxa"/>
-          </w:tblCellMar>
-        </w:tblPrEx>
         <w:tc>
           <w:tcPr>
             <w:tcW w:w="500" w:type="dxa"/>
@@ -1354,12 +1261,6 @@
         </w:tc>
       </w:tr>
       <w:tr>
-        <w:tblPrEx>
-          <w:tblCellMar>
-            <w:top w:w="0" w:type="dxa"/>
-            <w:bottom w:w="0" w:type="dxa"/>
-          </w:tblCellMar>
-        </w:tblPrEx>
         <w:tc>
           <w:tcPr>
             <w:tcW w:w="500" w:type="dxa"/>
@@ -1432,12 +1333,6 @@
         <w:gridCol w:w="2847"/>
       </w:tblGrid>
       <w:tr>
-        <w:tblPrEx>
-          <w:tblCellMar>
-            <w:top w:w="0" w:type="dxa"/>
-            <w:bottom w:w="0" w:type="dxa"/>
-          </w:tblCellMar>
-        </w:tblPrEx>
         <w:tc>
           <w:tcPr>
             <w:tcW w:w="10347" w:type="dxa"/>
@@ -1458,12 +1353,6 @@
         </w:tc>
       </w:tr>
       <w:tr>
-        <w:tblPrEx>
-          <w:tblCellMar>
-            <w:top w:w="0" w:type="dxa"/>
-            <w:bottom w:w="0" w:type="dxa"/>
-          </w:tblCellMar>
-        </w:tblPrEx>
         <w:tc>
           <w:tcPr>
             <w:tcW w:w="500" w:type="dxa"/>
@@ -1517,12 +1406,6 @@
         </w:tc>
       </w:tr>
       <w:tr>
-        <w:tblPrEx>
-          <w:tblCellMar>
-            <w:top w:w="0" w:type="dxa"/>
-            <w:bottom w:w="0" w:type="dxa"/>
-          </w:tblCellMar>
-        </w:tblPrEx>
         <w:tc>
           <w:tcPr>
             <w:tcW w:w="500" w:type="dxa"/>
@@ -1570,12 +1453,6 @@
         </w:tc>
       </w:tr>
       <w:tr>
-        <w:tblPrEx>
-          <w:tblCellMar>
-            <w:top w:w="0" w:type="dxa"/>
-            <w:bottom w:w="0" w:type="dxa"/>
-          </w:tblCellMar>
-        </w:tblPrEx>
         <w:tc>
           <w:tcPr>
             <w:tcW w:w="500" w:type="dxa"/>
@@ -1623,12 +1500,6 @@
         </w:tc>
       </w:tr>
       <w:tr>
-        <w:tblPrEx>
-          <w:tblCellMar>
-            <w:top w:w="0" w:type="dxa"/>
-            <w:bottom w:w="0" w:type="dxa"/>
-          </w:tblCellMar>
-        </w:tblPrEx>
         <w:tc>
           <w:tcPr>
             <w:tcW w:w="500" w:type="dxa"/>
@@ -1676,12 +1547,6 @@
         </w:tc>
       </w:tr>
       <w:tr>
-        <w:tblPrEx>
-          <w:tblCellMar>
-            <w:top w:w="0" w:type="dxa"/>
-            <w:bottom w:w="0" w:type="dxa"/>
-          </w:tblCellMar>
-        </w:tblPrEx>
         <w:tc>
           <w:tcPr>
             <w:tcW w:w="500" w:type="dxa"/>

</xml_diff>